<commit_message>
Add 5-minute Day 2 opening recap demo (Labs 1-5 click path) to Facilitator Playbook
</commit_message>
<xml_diff>
--- a/workshop-site/labs/Facilitator Playbook.docx
+++ b/workshop-site/labs/Facilitator Playbook.docx
@@ -173,6 +173,29 @@
           <w:sz w:val="24"/>
           <w:szCs w:val="24"/>
         </w:rPr>
+        <w:t xml:space="preserve">Real-world context: who's actually calling this in</w:t>
+      </w:r>
+    </w:p>
+    <w:p>
+      <w:pPr>
+        <w:spacing w:after="100"/>
+      </w:pPr>
+      <w:r>
+        <w:t xml:space="preserve">In the real world, this report wouldn't originate with the dispatcher. It would come down through Rail Traffic Control (RTC), Metro-North's own operations center responsible for train movements and signal/interlocking status. RTC typically hears about a fault like this one of three ways: a train engineer or conductor radios it in during their run, a signal maintainer either monitoring the interlocking remotely or dispatched to investigate reports it, or the interlocking's own diagnostic system throws an automated fault alert that RTC sees on their board. RTC then hands the report down to whoever owns rider communications and case tracking, which is the role the "dispatcher" persona represents in this demo. The dispatcher (and the Agentforce agent standing in for them) isn't diagnosing the signal fault; they're receiving RTC's report and turning it into a structured record and a public message, fast. It's worth naming that distinction out loud with an MTA audience; they'll know the RTC/dispatch split already and will notice if the demo glosses over it.</w:t>
+      </w:r>
+    </w:p>
+    <w:p>
+      <w:pPr>
+        <w:pStyle w:val="Heading3"/>
+        <w:spacing w:after="80" w:before="200"/>
+      </w:pPr>
+      <w:r>
+        <w:rPr>
+          <w:b/>
+          <w:bCs/>
+          <w:sz w:val="24"/>
+          <w:szCs w:val="24"/>
+        </w:rPr>
         <w:t xml:space="preserve">The demo script (about 10-12 minutes)</w:t>
       </w:r>
     </w:p>
@@ -351,6 +374,14 @@
           <w:iCs/>
         </w:rPr>
         <w:t xml:space="preserve">"That's the whole platform in about ninety seconds. A dispatcher types a sentence. The AI drafts public communication. A human approves it. Leadership sees it on a dashboard in real time. Over the next two days, you are going to build every piece of what you just watched, one layer at a time: the data model, the page layouts, the automation, the AI, the approval governance, and finally the agent that ties it together. By the end of Day 2, your own org will do exactly what mine just did."</w:t>
+      </w:r>
+    </w:p>
+    <w:p>
+      <w:pPr>
+        <w:spacing w:after="100"/>
+      </w:pPr>
+      <w:r>
+        <w:t xml:space="preserve">One thing worth saying out loud here: this specific scenario, a signal fault on the Hudson Line, is just one illustration. The pattern underneath it generalizes to almost any MTA intake process: streamlined case creation, AI-assisted classification and routing, governed public communications, and real-time operational visibility. Whatever variant of 'something happened and we need to respond fast and tell people about it' your agency deals with, this is the shape of the solution.</w:t>
       </w:r>
     </w:p>
     <w:p>
@@ -900,6 +931,535 @@
       </w:pPr>
       <w:r>
         <w:t xml:space="preserve">End of Day 1: confirm every participant has a Work Order tied to their Golden Case and, after Lab 5, a Service Disruption lookup populated on that Case. These are hard prerequisites for Day 2. If someone is more than one full lab behind at 4:50, this is exactly what the Day 1 catch-up package exists for; flag them for a post-session or early-morning catch-up deploy rather than holding up Day 1 wrap.</w:t>
+      </w:r>
+    </w:p>
+    <w:p>
+      <w:pPr>
+        <w:pStyle w:val="Heading1"/>
+        <w:spacing w:after="160" w:before="400"/>
+      </w:pPr>
+      <w:r>
+        <w:rPr>
+          <w:b/>
+          <w:bCs/>
+          <w:color w:val="1F4E79"/>
+        </w:rPr>
+        <w:t xml:space="preserve">Day 2 Opening Recap Demo (before Day 2 Verify, ~5 minutes)</w:t>
+      </w:r>
+    </w:p>
+    <w:p>
+      <w:pPr>
+        <w:spacing w:after="100"/>
+      </w:pPr>
+      <w:r>
+        <w:t xml:space="preserve">Run this in your own reference org, the same one built through Lab 5, on the same shared screen as yesterday's opening demo. This is a fast re-grounding, not a new teaching moment: the goal is reactivating what the room built on Day 1 before they open Lab 6. Keep it to five minutes. Don't demo anything from Lab 6 or Lab 7 here; today's new material gets its own framing in Batch C below.</w:t>
+      </w:r>
+    </w:p>
+    <w:p>
+      <w:pPr>
+        <w:pStyle w:val="Heading3"/>
+        <w:spacing w:after="80" w:before="200"/>
+      </w:pPr>
+      <w:r>
+        <w:rPr>
+          <w:b/>
+          <w:bCs/>
+          <w:sz w:val="24"/>
+          <w:szCs w:val="24"/>
+        </w:rPr>
+        <w:t xml:space="preserve">Setup before the room arrives</w:t>
+      </w:r>
+    </w:p>
+    <w:p>
+      <w:pPr>
+        <w:pStyle w:val="ListParagraph"/>
+        <w:numPr>
+          <w:ilvl w:val="0"/>
+          <w:numId w:val="1"/>
+        </w:numPr>
+        <w:spacing w:after="60"/>
+      </w:pPr>
+      <w:r>
+        <w:t xml:space="preserve">Your reference org has a fully built Golden Case (NYCT Record Type) linked all the way through: Asset (NYCT Bus 4521 with its 4 child components), an escalated Work Order (Work Type: Signal Repair), and a linked Service Disruption record. Have this Case open and ready before participants arrive; don't build any of this live.</w:t>
+      </w:r>
+    </w:p>
+    <w:p>
+      <w:pPr>
+        <w:pStyle w:val="Heading3"/>
+        <w:spacing w:after="80" w:before="200"/>
+      </w:pPr>
+      <w:r>
+        <w:rPr>
+          <w:b/>
+          <w:bCs/>
+          <w:sz w:val="24"/>
+          <w:szCs w:val="24"/>
+        </w:rPr>
+        <w:t xml:space="preserve">The click path (about 5 minutes)</w:t>
+      </w:r>
+    </w:p>
+    <w:p>
+      <w:pPr>
+        <w:pStyle w:val="Heading4"/>
+        <w:spacing w:after="40" w:before="160"/>
+      </w:pPr>
+      <w:r>
+        <w:rPr>
+          <w:b/>
+          <w:bCs/>
+        </w:rPr>
+        <w:t xml:space="preserve">0:00-0:30</w:t>
+      </w:r>
+    </w:p>
+    <w:p>
+      <w:pPr>
+        <w:spacing w:after="40" w:before="160"/>
+      </w:pPr>
+      <w:r>
+        <w:rPr>
+          <w:b/>
+          <w:bCs/>
+          <w:color w:val="1A76C7"/>
+          <w:sz w:val="20"/>
+          <w:szCs w:val="20"/>
+        </w:rPr>
+        <w:t xml:space="preserve">SAY</w:t>
+      </w:r>
+    </w:p>
+    <w:p>
+      <w:pPr>
+        <w:spacing w:after="160"/>
+      </w:pPr>
+      <w:r>
+        <w:rPr>
+          <w:i/>
+          <w:iCs/>
+        </w:rPr>
+        <w:t xml:space="preserve">"Before we open Lab 6, let's take five minutes and walk back through what you built yesterday. This is my Golden Case, NYCT Record Type, the same Record Type structure you built in Lab 1."</w:t>
+      </w:r>
+    </w:p>
+    <w:p>
+      <w:pPr>
+        <w:spacing w:after="40" w:before="160"/>
+      </w:pPr>
+      <w:r>
+        <w:rPr>
+          <w:b/>
+          <w:bCs/>
+          <w:color w:val="4A893B"/>
+          <w:sz w:val="20"/>
+          <w:szCs w:val="20"/>
+        </w:rPr>
+        <w:t xml:space="preserve">DO</w:t>
+      </w:r>
+    </w:p>
+    <w:p>
+      <w:pPr>
+        <w:spacing w:after="100"/>
+      </w:pPr>
+      <w:r>
+        <w:t xml:space="preserve">Open the Golden Case record in your reference org. Stay on the main record view.</w:t>
+      </w:r>
+    </w:p>
+    <w:p>
+      <w:pPr>
+        <w:pStyle w:val="Heading4"/>
+        <w:spacing w:after="40" w:before="160"/>
+      </w:pPr>
+      <w:r>
+        <w:rPr>
+          <w:b/>
+          <w:bCs/>
+        </w:rPr>
+        <w:t xml:space="preserve">0:30-1:00</w:t>
+      </w:r>
+    </w:p>
+    <w:p>
+      <w:pPr>
+        <w:spacing w:after="40" w:before="160"/>
+      </w:pPr>
+      <w:r>
+        <w:rPr>
+          <w:b/>
+          <w:bCs/>
+          <w:color w:val="1A76C7"/>
+          <w:sz w:val="20"/>
+          <w:szCs w:val="20"/>
+        </w:rPr>
+        <w:t xml:space="preserve">SAY</w:t>
+      </w:r>
+    </w:p>
+    <w:p>
+      <w:pPr>
+        <w:spacing w:after="160"/>
+      </w:pPr>
+      <w:r>
+        <w:rPr>
+          <w:i/>
+          <w:iCs/>
+        </w:rPr>
+        <w:t xml:space="preserve">"Everything you see on this record page, the fields, the layout, the visibility rules, you built by hand in Labs 1 and 2. Nothing here shipped out of the box."</w:t>
+      </w:r>
+    </w:p>
+    <w:p>
+      <w:pPr>
+        <w:spacing w:after="40" w:before="160"/>
+      </w:pPr>
+      <w:r>
+        <w:rPr>
+          <w:b/>
+          <w:bCs/>
+          <w:color w:val="4A893B"/>
+          <w:sz w:val="20"/>
+          <w:szCs w:val="20"/>
+        </w:rPr>
+        <w:t xml:space="preserve">DO</w:t>
+      </w:r>
+    </w:p>
+    <w:p>
+      <w:pPr>
+        <w:spacing w:after="100"/>
+      </w:pPr>
+      <w:r>
+        <w:t xml:space="preserve">Point at the Dynamic Forms canvas fields (Reported Date/Time, Resolution Notes) and the "Other related cases" tab built in Lab 2. Don't click away yet.</w:t>
+      </w:r>
+    </w:p>
+    <w:p>
+      <w:pPr>
+        <w:pStyle w:val="Heading4"/>
+        <w:spacing w:after="40" w:before="160"/>
+      </w:pPr>
+      <w:r>
+        <w:rPr>
+          <w:b/>
+          <w:bCs/>
+        </w:rPr>
+        <w:t xml:space="preserve">1:00-1:45</w:t>
+      </w:r>
+    </w:p>
+    <w:p>
+      <w:pPr>
+        <w:spacing w:after="40" w:before="160"/>
+      </w:pPr>
+      <w:r>
+        <w:rPr>
+          <w:b/>
+          <w:bCs/>
+          <w:color w:val="1A76C7"/>
+          <w:sz w:val="20"/>
+          <w:szCs w:val="20"/>
+        </w:rPr>
+        <w:t xml:space="preserve">SAY</w:t>
+      </w:r>
+    </w:p>
+    <w:p>
+      <w:pPr>
+        <w:spacing w:after="160"/>
+      </w:pPr>
+      <w:r>
+        <w:rPr>
+          <w:i/>
+          <w:iCs/>
+        </w:rPr>
+        <w:t xml:space="preserve">"This Case points at a physical asset, a bus, with four components underneath it. You built this parent-child hierarchy in Lab 3, all on the standard Asset object, zero custom fields."</w:t>
+      </w:r>
+    </w:p>
+    <w:p>
+      <w:pPr>
+        <w:spacing w:after="40" w:before="160"/>
+      </w:pPr>
+      <w:r>
+        <w:rPr>
+          <w:b/>
+          <w:bCs/>
+          <w:color w:val="4A893B"/>
+          <w:sz w:val="20"/>
+          <w:szCs w:val="20"/>
+        </w:rPr>
+        <w:t xml:space="preserve">DO</w:t>
+      </w:r>
+    </w:p>
+    <w:p>
+      <w:pPr>
+        <w:spacing w:after="100"/>
+      </w:pPr>
+      <w:r>
+        <w:t xml:space="preserve">Click the Asset lookup to open NYCT Bus 4521. Show the Child Assets related list (the four components).</w:t>
+      </w:r>
+    </w:p>
+    <w:p>
+      <w:pPr>
+        <w:pStyle w:val="Heading4"/>
+        <w:spacing w:after="40" w:before="160"/>
+      </w:pPr>
+      <w:r>
+        <w:rPr>
+          <w:b/>
+          <w:bCs/>
+        </w:rPr>
+        <w:t xml:space="preserve">1:45-2:30</w:t>
+      </w:r>
+    </w:p>
+    <w:p>
+      <w:pPr>
+        <w:spacing w:after="40" w:before="160"/>
+      </w:pPr>
+      <w:r>
+        <w:rPr>
+          <w:b/>
+          <w:bCs/>
+          <w:color w:val="1A76C7"/>
+          <w:sz w:val="20"/>
+          <w:szCs w:val="20"/>
+        </w:rPr>
+        <w:t xml:space="preserve">SAY</w:t>
+      </w:r>
+    </w:p>
+    <w:p>
+      <w:pPr>
+        <w:spacing w:after="160"/>
+      </w:pPr>
+      <w:r>
+        <w:rPr>
+          <w:i/>
+          <w:iCs/>
+        </w:rPr>
+        <w:t xml:space="preserve">"From there, Lab 4 escalated this exact Case into a dispatched Work Order, tied to the same Asset, with a Work Type you built from scratch: Signal Repair."</w:t>
+      </w:r>
+    </w:p>
+    <w:p>
+      <w:pPr>
+        <w:spacing w:after="40" w:before="160"/>
+      </w:pPr>
+      <w:r>
+        <w:rPr>
+          <w:b/>
+          <w:bCs/>
+          <w:color w:val="4A893B"/>
+          <w:sz w:val="20"/>
+          <w:szCs w:val="20"/>
+        </w:rPr>
+        <w:t xml:space="preserve">DO</w:t>
+      </w:r>
+    </w:p>
+    <w:p>
+      <w:pPr>
+        <w:spacing w:after="100"/>
+      </w:pPr>
+      <w:r>
+        <w:t xml:space="preserve">Navigate back to the Case, then open the related Work Order. Point at the Work Type field and the Asset lookup confirming it's the same bus.</w:t>
+      </w:r>
+    </w:p>
+    <w:p>
+      <w:pPr>
+        <w:pStyle w:val="Heading4"/>
+        <w:spacing w:after="40" w:before="160"/>
+      </w:pPr>
+      <w:r>
+        <w:rPr>
+          <w:b/>
+          <w:bCs/>
+        </w:rPr>
+        <w:t xml:space="preserve">2:30-3:30</w:t>
+      </w:r>
+    </w:p>
+    <w:p>
+      <w:pPr>
+        <w:spacing w:after="40" w:before="160"/>
+      </w:pPr>
+      <w:r>
+        <w:rPr>
+          <w:b/>
+          <w:bCs/>
+          <w:color w:val="1A76C7"/>
+          <w:sz w:val="20"/>
+          <w:szCs w:val="20"/>
+        </w:rPr>
+        <w:t xml:space="preserve">SAY</w:t>
+      </w:r>
+    </w:p>
+    <w:p>
+      <w:pPr>
+        <w:spacing w:after="160"/>
+      </w:pPr>
+      <w:r>
+        <w:rPr>
+          <w:i/>
+          <w:iCs/>
+        </w:rPr>
+        <w:t xml:space="preserve">"And finally, Lab 5 is the one moment across two days where we built something new instead of extending something standard: Service Disruption. Four Record Types mirroring your agency structure, linked right back to this Case."</w:t>
+      </w:r>
+    </w:p>
+    <w:p>
+      <w:pPr>
+        <w:spacing w:after="40" w:before="160"/>
+      </w:pPr>
+      <w:r>
+        <w:rPr>
+          <w:b/>
+          <w:bCs/>
+          <w:color w:val="4A893B"/>
+          <w:sz w:val="20"/>
+          <w:szCs w:val="20"/>
+        </w:rPr>
+        <w:t xml:space="preserve">DO</w:t>
+      </w:r>
+    </w:p>
+    <w:p>
+      <w:pPr>
+        <w:spacing w:after="100"/>
+      </w:pPr>
+      <w:r>
+        <w:t xml:space="preserve">Navigate to the Service Disruption record linked from the Case. Point at its Record Type and its fields.</w:t>
+      </w:r>
+    </w:p>
+    <w:p>
+      <w:pPr>
+        <w:pStyle w:val="Heading4"/>
+        <w:spacing w:after="40" w:before="160"/>
+      </w:pPr>
+      <w:r>
+        <w:rPr>
+          <w:b/>
+          <w:bCs/>
+        </w:rPr>
+        <w:t xml:space="preserve">3:30-4:15</w:t>
+      </w:r>
+    </w:p>
+    <w:p>
+      <w:pPr>
+        <w:spacing w:after="40" w:before="160"/>
+      </w:pPr>
+      <w:r>
+        <w:rPr>
+          <w:b/>
+          <w:bCs/>
+          <w:color w:val="1A76C7"/>
+          <w:sz w:val="20"/>
+          <w:szCs w:val="20"/>
+        </w:rPr>
+        <w:t xml:space="preserve">SAY</w:t>
+      </w:r>
+    </w:p>
+    <w:p>
+      <w:pPr>
+        <w:spacing w:after="160"/>
+      </w:pPr>
+      <w:r>
+        <w:rPr>
+          <w:i/>
+          <w:iCs/>
+        </w:rPr>
+        <w:t xml:space="preserve">"Walk the chain backwards with me: Service Disruption, Work Order, Asset, Case. One record touches five labs. That's not an accident. That's the Standard-First pattern: extend what's already there, and add exactly one custom object when the standard objects genuinely don't fit."</w:t>
+      </w:r>
+    </w:p>
+    <w:p>
+      <w:pPr>
+        <w:spacing w:after="40" w:before="160"/>
+      </w:pPr>
+      <w:r>
+        <w:rPr>
+          <w:b/>
+          <w:bCs/>
+          <w:color w:val="4A893B"/>
+          <w:sz w:val="20"/>
+          <w:szCs w:val="20"/>
+        </w:rPr>
+        <w:t xml:space="preserve">DO</w:t>
+      </w:r>
+    </w:p>
+    <w:p>
+      <w:pPr>
+        <w:spacing w:after="100"/>
+      </w:pPr>
+      <w:r>
+        <w:t xml:space="preserve">No new clicks. Stay on the Service Disruption record, or flip back to the Case, while you say this. This is the summary beat, give it room to land.</w:t>
+      </w:r>
+    </w:p>
+    <w:p>
+      <w:pPr>
+        <w:pStyle w:val="Heading4"/>
+        <w:spacing w:after="40" w:before="160"/>
+      </w:pPr>
+      <w:r>
+        <w:rPr>
+          <w:b/>
+          <w:bCs/>
+        </w:rPr>
+        <w:t xml:space="preserve">4:15-5:00</w:t>
+      </w:r>
+    </w:p>
+    <w:p>
+      <w:pPr>
+        <w:spacing w:after="40" w:before="160"/>
+      </w:pPr>
+      <w:r>
+        <w:rPr>
+          <w:b/>
+          <w:bCs/>
+          <w:color w:val="1A76C7"/>
+          <w:sz w:val="20"/>
+          <w:szCs w:val="20"/>
+        </w:rPr>
+        <w:t xml:space="preserve">SAY</w:t>
+      </w:r>
+    </w:p>
+    <w:p>
+      <w:pPr>
+        <w:spacing w:after="160"/>
+      </w:pPr>
+      <w:r>
+        <w:rPr>
+          <w:i/>
+          <w:iCs/>
+        </w:rPr>
+        <w:t xml:space="preserve">"Today we add the platform layer on top of this foundation: validation, automation, AI, approval governance, reporting, and an agent that ties it all together. By 3:00 this afternoon you're going to run a live incident simulation using everything you just saw, plus everything you're about to build. Let's open Day 2 Verify."</w:t>
+      </w:r>
+    </w:p>
+    <w:p>
+      <w:pPr>
+        <w:spacing w:after="40" w:before="160"/>
+      </w:pPr>
+      <w:r>
+        <w:rPr>
+          <w:b/>
+          <w:bCs/>
+          <w:color w:val="C17510"/>
+          <w:sz w:val="20"/>
+          <w:szCs w:val="20"/>
+        </w:rPr>
+        <w:t xml:space="preserve">WATCH FOR</w:t>
+      </w:r>
+    </w:p>
+    <w:p>
+      <w:pPr>
+        <w:spacing w:after="100"/>
+      </w:pPr>
+      <w:r>
+        <w:t xml:space="preserve">This demo deliberately skips Lab 2's visibility-rule mechanics, Lab 3's AssetRelationship peer link, and Lab 4's Work Type creation details, there's no time in 5 minutes and that's not the point. The point is the chain, not the mechanics. If someone asks a mechanics question, answer briefly and move on; save depth for one-on-one help once labs resume.</w:t>
+      </w:r>
+    </w:p>
+    <w:p>
+      <w:pPr>
+        <w:spacing w:after="40" w:before="160"/>
+      </w:pPr>
+      <w:r>
+        <w:rPr>
+          <w:b/>
+          <w:bCs/>
+          <w:color w:val="C17510"/>
+          <w:sz w:val="20"/>
+          <w:szCs w:val="20"/>
+        </w:rPr>
+        <w:t xml:space="preserve">WATCH FOR</w:t>
+      </w:r>
+    </w:p>
+    <w:p>
+      <w:pPr>
+        <w:spacing w:after="100"/>
+      </w:pPr>
+      <w:r>
+        <w:t xml:space="preserve">If your reference org's chain is incomplete, missing the Work Order or Service Disruption link, fix it before Day 2 starts. Don't skip a step live or improvise; the five-minute pacing depends on every click landing cleanly.</w:t>
       </w:r>
     </w:p>
     <w:p>

</xml_diff>